<commit_message>
Preserve English concept highlighting and simplify worksheet introduction
</commit_message>
<xml_diff>
--- a/paperwork/generated/WS1_answers_en.docx
+++ b/paperwork/generated/WS1_answers_en.docx
@@ -40,7 +40,7 @@
         <w:rPr>
           <w:sz w:val="24"/>
         </w:rPr>
-        <w:t>Read the topic notes, then answer using the context and model results. Red bold terms highlight key concepts. You do not need to operate the virtual lab.</w:t>
+        <w:t>Read the topic notes, then answer using the context and model results.</w:t>
       </w:r>
     </w:p>
     <w:p>
@@ -75,7 +75,105 @@
         <w:rPr>
           <w:sz w:val="24"/>
         </w:rPr>
-        <w:t>In this model, X is bile. Made in the liver and stored in the gall bladder, bile contains no digestive enzymes. It emulsifies large oil droplets into small droplets, increasing the total surface area for lipase to act on. This is physical digestion: lipid molecules remain unchanged.</w:t>
+        <w:t xml:space="preserve">In this model, X is </w:t>
+      </w:r>
+      <w:r>
+        <w:rPr>
+          <w:b/>
+          <w:color w:val="B7312C"/>
+          <w:sz w:val="24"/>
+        </w:rPr>
+        <w:t>bile</w:t>
+      </w:r>
+      <w:r>
+        <w:rPr>
+          <w:sz w:val="24"/>
+        </w:rPr>
+        <w:t xml:space="preserve">. Made in the liver and stored in the gall bladder, </w:t>
+      </w:r>
+      <w:r>
+        <w:rPr>
+          <w:b/>
+          <w:color w:val="B7312C"/>
+          <w:sz w:val="24"/>
+        </w:rPr>
+        <w:t>bile</w:t>
+      </w:r>
+      <w:r>
+        <w:rPr>
+          <w:sz w:val="24"/>
+        </w:rPr>
+        <w:t xml:space="preserve"> contains no digestive enzymes. It </w:t>
+      </w:r>
+      <w:r>
+        <w:rPr>
+          <w:b/>
+          <w:color w:val="B7312C"/>
+          <w:sz w:val="24"/>
+        </w:rPr>
+        <w:t>emulsifies</w:t>
+      </w:r>
+      <w:r>
+        <w:rPr>
+          <w:sz w:val="24"/>
+        </w:rPr>
+        <w:t xml:space="preserve"> large oil droplets into </w:t>
+      </w:r>
+      <w:r>
+        <w:rPr>
+          <w:b/>
+          <w:color w:val="B7312C"/>
+          <w:sz w:val="24"/>
+        </w:rPr>
+        <w:t>small droplets</w:t>
+      </w:r>
+      <w:r>
+        <w:rPr>
+          <w:sz w:val="24"/>
+        </w:rPr>
+        <w:t xml:space="preserve">, increasing the </w:t>
+      </w:r>
+      <w:r>
+        <w:rPr>
+          <w:b/>
+          <w:color w:val="B7312C"/>
+          <w:sz w:val="24"/>
+        </w:rPr>
+        <w:t>total surface area</w:t>
+      </w:r>
+      <w:r>
+        <w:rPr>
+          <w:sz w:val="24"/>
+        </w:rPr>
+        <w:t xml:space="preserve"> for </w:t>
+      </w:r>
+      <w:r>
+        <w:rPr>
+          <w:b/>
+          <w:color w:val="B7312C"/>
+          <w:sz w:val="24"/>
+        </w:rPr>
+        <w:t>lipase</w:t>
+      </w:r>
+      <w:r>
+        <w:rPr>
+          <w:sz w:val="24"/>
+        </w:rPr>
+        <w:t xml:space="preserve"> to act on. This is </w:t>
+      </w:r>
+      <w:r>
+        <w:rPr>
+          <w:b/>
+          <w:color w:val="B7312C"/>
+          <w:sz w:val="24"/>
+        </w:rPr>
+        <w:t>physical digestion</w:t>
+      </w:r>
+      <w:r>
+        <w:rPr>
+          <w:sz w:val="24"/>
+        </w:rPr>
+        <w:t>: lipid molecules remain unchanged.</w:t>
       </w:r>
     </w:p>
     <w:p>
@@ -147,7 +245,147 @@
         <w:rPr>
           <w:sz w:val="24"/>
         </w:rPr>
-        <w:t>In this model, Y is pancreatic juice containing lipase. Lipase catalyses chemical digestion of lipids. This course uses a simplified complete-hydrolysis model: triglycerides form smaller glycerol and fatty-acid molecules for absorption. Lipase is a protein; high heat can denature it and stop it working.</w:t>
+        <w:t xml:space="preserve">In this model, Y is </w:t>
+      </w:r>
+      <w:r>
+        <w:rPr>
+          <w:b/>
+          <w:color w:val="B7312C"/>
+          <w:sz w:val="24"/>
+        </w:rPr>
+        <w:t>pancreatic juice</w:t>
+      </w:r>
+      <w:r>
+        <w:rPr>
+          <w:sz w:val="24"/>
+        </w:rPr>
+        <w:t xml:space="preserve"> containing </w:t>
+      </w:r>
+      <w:r>
+        <w:rPr>
+          <w:b/>
+          <w:color w:val="B7312C"/>
+          <w:sz w:val="24"/>
+        </w:rPr>
+        <w:t>lipase</w:t>
+      </w:r>
+      <w:r>
+        <w:rPr>
+          <w:sz w:val="24"/>
+        </w:rPr>
+        <w:t xml:space="preserve">. </w:t>
+      </w:r>
+      <w:r>
+        <w:rPr>
+          <w:b/>
+          <w:color w:val="B7312C"/>
+          <w:sz w:val="24"/>
+        </w:rPr>
+        <w:t>Lipase</w:t>
+      </w:r>
+      <w:r>
+        <w:rPr>
+          <w:sz w:val="24"/>
+        </w:rPr>
+        <w:t xml:space="preserve"> catalyses </w:t>
+      </w:r>
+      <w:r>
+        <w:rPr>
+          <w:b/>
+          <w:color w:val="B7312C"/>
+          <w:sz w:val="24"/>
+        </w:rPr>
+        <w:t>chemical digestion</w:t>
+      </w:r>
+      <w:r>
+        <w:rPr>
+          <w:sz w:val="24"/>
+        </w:rPr>
+        <w:t xml:space="preserve"> of lipids. This course uses a simplified complete-hydrolysis model: </w:t>
+      </w:r>
+      <w:r>
+        <w:rPr>
+          <w:b/>
+          <w:color w:val="B7312C"/>
+          <w:sz w:val="24"/>
+        </w:rPr>
+        <w:t>triglycerides</w:t>
+      </w:r>
+      <w:r>
+        <w:rPr>
+          <w:sz w:val="24"/>
+        </w:rPr>
+        <w:t xml:space="preserve"> form smaller </w:t>
+      </w:r>
+      <w:r>
+        <w:rPr>
+          <w:b/>
+          <w:color w:val="B7312C"/>
+          <w:sz w:val="24"/>
+        </w:rPr>
+        <w:t>glycerol</w:t>
+      </w:r>
+      <w:r>
+        <w:rPr>
+          <w:sz w:val="24"/>
+        </w:rPr>
+        <w:t xml:space="preserve"> and </w:t>
+      </w:r>
+      <w:r>
+        <w:rPr>
+          <w:b/>
+          <w:color w:val="B7312C"/>
+          <w:sz w:val="24"/>
+        </w:rPr>
+        <w:t>fatty-acid</w:t>
+      </w:r>
+      <w:r>
+        <w:rPr>
+          <w:sz w:val="24"/>
+        </w:rPr>
+        <w:t xml:space="preserve"> molecules for absorption. </w:t>
+      </w:r>
+      <w:r>
+        <w:rPr>
+          <w:b/>
+          <w:color w:val="B7312C"/>
+          <w:sz w:val="24"/>
+        </w:rPr>
+        <w:t>Lipase</w:t>
+      </w:r>
+      <w:r>
+        <w:rPr>
+          <w:sz w:val="24"/>
+        </w:rPr>
+        <w:t xml:space="preserve"> is a </w:t>
+      </w:r>
+      <w:r>
+        <w:rPr>
+          <w:b/>
+          <w:color w:val="B7312C"/>
+          <w:sz w:val="24"/>
+        </w:rPr>
+        <w:t>protein</w:t>
+      </w:r>
+      <w:r>
+        <w:rPr>
+          <w:sz w:val="24"/>
+        </w:rPr>
+        <w:t xml:space="preserve">; high heat can </w:t>
+      </w:r>
+      <w:r>
+        <w:rPr>
+          <w:b/>
+          <w:color w:val="B7312C"/>
+          <w:sz w:val="24"/>
+        </w:rPr>
+        <w:t>denature</w:t>
+      </w:r>
+      <w:r>
+        <w:rPr>
+          <w:sz w:val="24"/>
+        </w:rPr>
+        <w:t xml:space="preserve"> it and stop it working.</w:t>
       </w:r>
     </w:p>
     <w:p>
@@ -371,9 +609,16 @@
             </w:pPr>
             <w:r>
               <w:rPr>
+                <w:b/>
+                <w:color w:val="B7312C"/>
                 <w:sz w:val="24"/>
               </w:rPr>
               <w:t>Independent variable</w:t>
+            </w:r>
+            <w:r>
+              <w:rPr>
+                <w:sz w:val="24"/>
+              </w:rPr>
               <w:br/>
               <w:t>Factor changed</w:t>
             </w:r>
@@ -407,11 +652,6 @@
               </w:rPr>
               <w:t>Combination of digestive juices</w:t>
             </w:r>
-            <w:r>
-              <w:rPr>
-                <w:sz w:val="24"/>
-              </w:rPr>
-            </w:r>
           </w:p>
         </w:tc>
       </w:tr>
@@ -432,9 +672,16 @@
             </w:pPr>
             <w:r>
               <w:rPr>
+                <w:b/>
+                <w:color w:val="B7312C"/>
                 <w:sz w:val="24"/>
               </w:rPr>
               <w:t>Dependent variable</w:t>
+            </w:r>
+            <w:r>
+              <w:rPr>
+                <w:sz w:val="24"/>
+              </w:rPr>
               <w:br/>
               <w:t>Outcome measured</w:t>
             </w:r>
@@ -494,9 +741,16 @@
             </w:pPr>
             <w:r>
               <w:rPr>
+                <w:b/>
+                <w:color w:val="B7312C"/>
                 <w:sz w:val="24"/>
               </w:rPr>
               <w:t>Controlled variables</w:t>
+            </w:r>
+            <w:r>
+              <w:rPr>
+                <w:sz w:val="24"/>
+              </w:rPr>
               <w:br/>
               <w:t>Kept the same</w:t>
             </w:r>
@@ -513,11 +767,6 @@
                 <w:lang w:eastAsia="zh-TW"/>
               </w:rPr>
             </w:pPr>
-            <w:r>
-              <w:rPr>
-                <w:sz w:val="24"/>
-              </w:rPr>
-            </w:r>
             <w:r>
               <w:rPr>
                 <w:b/>
@@ -707,7 +956,21 @@
         <w:rPr>
           <w:sz w:val="24"/>
         </w:rPr>
-        <w:t>Does this experiment need a control group? If so, how would you design the comparison setup?</w:t>
+        <w:t xml:space="preserve">Does this experiment need a </w:t>
+      </w:r>
+      <w:r>
+        <w:rPr>
+          <w:b/>
+          <w:color w:val="B7312C"/>
+          <w:sz w:val="24"/>
+        </w:rPr>
+        <w:t>control group</w:t>
+      </w:r>
+      <w:r>
+        <w:rPr>
+          <w:sz w:val="24"/>
+        </w:rPr>
+        <w:t>? If so, how would you design the comparison setup?</w:t>
       </w:r>
     </w:p>
     <w:p>
@@ -878,7 +1141,35 @@
         <w:rPr>
           <w:sz w:val="24"/>
         </w:rPr>
-        <w:t>X disperses large oil droplets into small droplets. Their total surface area (</w:t>
+        <w:t xml:space="preserve">X disperses large oil droplets into </w:t>
+      </w:r>
+      <w:r>
+        <w:rPr>
+          <w:b/>
+          <w:color w:val="B7312C"/>
+          <w:sz w:val="24"/>
+        </w:rPr>
+        <w:t>small droplets</w:t>
+      </w:r>
+      <w:r>
+        <w:rPr>
+          <w:sz w:val="24"/>
+        </w:rPr>
+        <w:t xml:space="preserve">. Their </w:t>
+      </w:r>
+      <w:r>
+        <w:rPr>
+          <w:b/>
+          <w:color w:val="B7312C"/>
+          <w:sz w:val="24"/>
+        </w:rPr>
+        <w:t>total surface area</w:t>
+      </w:r>
+      <w:r>
+        <w:rPr>
+          <w:sz w:val="24"/>
+        </w:rPr>
+        <w:t xml:space="preserve"> (</w:t>
       </w:r>
       <w:r>
         <w:rPr>
@@ -946,7 +1237,35 @@
         <w:rPr>
           <w:sz w:val="24"/>
         </w:rPr>
-        <w:t>B. A clear mixture fully proves that lipids have broken down into glycerol and fatty acids.</w:t>
+        <w:t xml:space="preserve">B. A clear mixture fully proves that lipids have broken down into </w:t>
+      </w:r>
+      <w:r>
+        <w:rPr>
+          <w:b/>
+          <w:color w:val="B7312C"/>
+          <w:sz w:val="24"/>
+        </w:rPr>
+        <w:t>glycerol</w:t>
+      </w:r>
+      <w:r>
+        <w:rPr>
+          <w:sz w:val="24"/>
+        </w:rPr>
+        <w:t xml:space="preserve"> and </w:t>
+      </w:r>
+      <w:r>
+        <w:rPr>
+          <w:b/>
+          <w:color w:val="B7312C"/>
+          <w:sz w:val="24"/>
+        </w:rPr>
+        <w:t>fatty acids</w:t>
+      </w:r>
+      <w:r>
+        <w:rPr>
+          <w:sz w:val="24"/>
+        </w:rPr>
+        <w:t>.</w:t>
       </w:r>
     </w:p>
     <w:p>

</xml_diff>